<commit_message>
Update Academic Report with 10 comprehensive figures and fix tab title contrast in dashboard
</commit_message>
<xml_diff>
--- a/FINAL_ACADEMIC_PROJECT_REPORT.docx
+++ b/FINAL_ACADEMIC_PROJECT_REPORT.docx
@@ -1047,13 +1047,17 @@
     </w:tbl>
     <w:p>
       <w:pPr>
-        <w:spacing w:after="160"/>
+        <w:spacing w:after="240"/>
       </w:pPr>
     </w:p>
     <w:p>
+      <w:pPr>
+        <w:spacing w:before="160" w:after="40"/>
+      </w:pPr>
       <w:r>
         <w:rPr>
           <w:b/>
+          <w:sz w:val="20"/>
         </w:rPr>
         <w:t>Figure 1: Enterprise Cloud Operations Dashboard Overview</w:t>
       </w:r>
@@ -1095,6 +1099,9 @@
       </w:r>
     </w:p>
     <w:p>
+      <w:pPr>
+        <w:spacing w:before="40" w:after="200"/>
+      </w:pPr>
       <w:r>
         <w:rPr>
           <w:i/>
@@ -1105,15 +1112,74 @@
     </w:p>
     <w:p>
       <w:pPr>
-        <w:spacing w:after="160"/>
+        <w:spacing w:before="160" w:after="40"/>
       </w:pPr>
+      <w:r>
+        <w:rPr>
+          <w:b/>
+          <w:sz w:val="20"/>
+        </w:rPr>
+        <w:t>Figure 2: Real-Time Ingress Alert &amp; Telemetry Outage Detection</w:t>
+      </w:r>
     </w:p>
     <w:p>
       <w:r>
+        <w:drawing>
+          <wp:inline xmlns:a="http://schemas.openxmlformats.org/drawingml/2006/main" xmlns:pic="http://schemas.openxmlformats.org/drawingml/2006/picture">
+            <wp:extent cx="5669280" cy="4700409"/>
+            <wp:docPr id="2" name="Picture 2"/>
+            <wp:cNvGraphicFramePr>
+              <a:graphicFrameLocks noChangeAspect="1"/>
+            </wp:cNvGraphicFramePr>
+            <a:graphic>
+              <a:graphicData uri="http://schemas.openxmlformats.org/drawingml/2006/picture">
+                <pic:pic>
+                  <pic:nvPicPr>
+                    <pic:cNvPr id="0" name="media_1791250309056.png"/>
+                    <pic:cNvPicPr/>
+                  </pic:nvPicPr>
+                  <pic:blipFill>
+                    <a:blip r:embed="rId10"/>
+                    <a:stretch>
+                      <a:fillRect/>
+                    </a:stretch>
+                  </pic:blipFill>
+                  <pic:spPr>
+                    <a:xfrm>
+                      <a:off x="0" y="0"/>
+                      <a:ext cx="5669280" cy="4700409"/>
+                    </a:xfrm>
+                    <a:prstGeom prst="rect"/>
+                  </pic:spPr>
+                </pic:pic>
+              </a:graphicData>
+            </a:graphic>
+          </wp:inline>
+        </w:drawing>
+      </w:r>
+    </w:p>
+    <w:p>
+      <w:pPr>
+        <w:spacing w:before="40" w:after="200"/>
+      </w:pPr>
+      <w:r>
+        <w:rPr>
+          <w:i/>
+          <w:sz w:val="18"/>
+        </w:rPr>
+        <w:t>Active Outage Detection showing microservice degradation across the payment request flow.</w:t>
+      </w:r>
+    </w:p>
+    <w:p>
+      <w:pPr>
+        <w:spacing w:before="160" w:after="40"/>
+      </w:pPr>
+      <w:r>
         <w:rPr>
           <w:b/>
+          <w:sz w:val="20"/>
         </w:rPr>
-        <w:t>Figure 2: Causal Reasoning DAG Traversal &amp; Root-Cause Isolation</w:t>
+        <w:t>Figure 3: Causal Reasoning DAG Traversal &amp; Root-Cause Isolation</w:t>
       </w:r>
     </w:p>
     <w:p>
@@ -1121,7 +1187,7 @@
         <w:drawing>
           <wp:inline xmlns:a="http://schemas.openxmlformats.org/drawingml/2006/main" xmlns:pic="http://schemas.openxmlformats.org/drawingml/2006/picture">
             <wp:extent cx="5669280" cy="2665104"/>
-            <wp:docPr id="2" name="Picture 2"/>
+            <wp:docPr id="3" name="Picture 3"/>
             <wp:cNvGraphicFramePr>
               <a:graphicFrameLocks noChangeAspect="1"/>
             </wp:cNvGraphicFramePr>
@@ -1133,7 +1199,7 @@
                     <pic:cNvPicPr/>
                   </pic:nvPicPr>
                   <pic:blipFill>
-                    <a:blip r:embed="rId10"/>
+                    <a:blip r:embed="rId11"/>
                     <a:stretch>
                       <a:fillRect/>
                     </a:stretch>
@@ -1153,6 +1219,9 @@
       </w:r>
     </w:p>
     <w:p>
+      <w:pPr>
+        <w:spacing w:before="40" w:after="200"/>
+      </w:pPr>
       <w:r>
         <w:rPr>
           <w:i/>
@@ -1163,15 +1232,14 @@
     </w:p>
     <w:p>
       <w:pPr>
-        <w:spacing w:after="160"/>
+        <w:spacing w:before="160" w:after="40"/>
       </w:pPr>
-    </w:p>
-    <w:p>
       <w:r>
         <w:rPr>
           <w:b/>
+          <w:sz w:val="20"/>
         </w:rPr>
-        <w:t>Figure 3: Full Multi-Branch Production Reasoning Topology</w:t>
+        <w:t>Figure 4: Full Multi-Branch Production Reasoning Topology</w:t>
       </w:r>
     </w:p>
     <w:p>
@@ -1179,7 +1247,7 @@
         <w:drawing>
           <wp:inline xmlns:a="http://schemas.openxmlformats.org/drawingml/2006/main" xmlns:pic="http://schemas.openxmlformats.org/drawingml/2006/picture">
             <wp:extent cx="5669280" cy="2779276"/>
-            <wp:docPr id="3" name="Picture 3"/>
+            <wp:docPr id="4" name="Picture 4"/>
             <wp:cNvGraphicFramePr>
               <a:graphicFrameLocks noChangeAspect="1"/>
             </wp:cNvGraphicFramePr>
@@ -1191,7 +1259,7 @@
                     <pic:cNvPicPr/>
                   </pic:nvPicPr>
                   <pic:blipFill>
-                    <a:blip r:embed="rId11"/>
+                    <a:blip r:embed="rId12"/>
                     <a:stretch>
                       <a:fillRect/>
                     </a:stretch>
@@ -1211,6 +1279,9 @@
       </w:r>
     </w:p>
     <w:p>
+      <w:pPr>
+        <w:spacing w:before="40" w:after="200"/>
+      </w:pPr>
       <w:r>
         <w:rPr>
           <w:i/>
@@ -1221,8 +1292,363 @@
     </w:p>
     <w:p>
       <w:pPr>
-        <w:spacing w:after="160"/>
+        <w:spacing w:before="160" w:after="40"/>
       </w:pPr>
+      <w:r>
+        <w:rPr>
+          <w:b/>
+          <w:sz w:val="20"/>
+        </w:rPr>
+        <w:t>Figure 5: Mathematical DAG Coordinate View &amp; Traversal Trace Table</w:t>
+      </w:r>
+    </w:p>
+    <w:p>
+      <w:r>
+        <w:drawing>
+          <wp:inline xmlns:a="http://schemas.openxmlformats.org/drawingml/2006/main" xmlns:pic="http://schemas.openxmlformats.org/drawingml/2006/picture">
+            <wp:extent cx="5669280" cy="4772665"/>
+            <wp:docPr id="5" name="Picture 5"/>
+            <wp:cNvGraphicFramePr>
+              <a:graphicFrameLocks noChangeAspect="1"/>
+            </wp:cNvGraphicFramePr>
+            <a:graphic>
+              <a:graphicData uri="http://schemas.openxmlformats.org/drawingml/2006/picture">
+                <pic:pic>
+                  <pic:nvPicPr>
+                    <pic:cNvPr id="0" name="media_1791261636277.png"/>
+                    <pic:cNvPicPr/>
+                  </pic:nvPicPr>
+                  <pic:blipFill>
+                    <a:blip r:embed="rId13"/>
+                    <a:stretch>
+                      <a:fillRect/>
+                    </a:stretch>
+                  </pic:blipFill>
+                  <pic:spPr>
+                    <a:xfrm>
+                      <a:off x="0" y="0"/>
+                      <a:ext cx="5669280" cy="4772665"/>
+                    </a:xfrm>
+                    <a:prstGeom prst="rect"/>
+                  </pic:spPr>
+                </pic:pic>
+              </a:graphicData>
+            </a:graphic>
+          </wp:inline>
+        </w:drawing>
+      </w:r>
+    </w:p>
+    <w:p>
+      <w:pPr>
+        <w:spacing w:before="40" w:after="200"/>
+      </w:pPr>
+      <w:r>
+        <w:rPr>
+          <w:i/>
+          <w:sz w:val="18"/>
+        </w:rPr>
+        <w:t>Mathematical DAG Coordinate View and Traversal Step Trace Table.</w:t>
+      </w:r>
+    </w:p>
+    <w:p>
+      <w:pPr>
+        <w:spacing w:before="160" w:after="40"/>
+      </w:pPr>
+      <w:r>
+        <w:rPr>
+          <w:b/>
+          <w:sz w:val="20"/>
+        </w:rPr>
+        <w:t>Figure 6: Closed-Loop Self-Evolution &amp; Quantitative MTTR Reduction Benchmark</w:t>
+      </w:r>
+    </w:p>
+    <w:p>
+      <w:r>
+        <w:drawing>
+          <wp:inline xmlns:a="http://schemas.openxmlformats.org/drawingml/2006/main" xmlns:pic="http://schemas.openxmlformats.org/drawingml/2006/picture">
+            <wp:extent cx="5669280" cy="3980676"/>
+            <wp:docPr id="6" name="Picture 6"/>
+            <wp:cNvGraphicFramePr>
+              <a:graphicFrameLocks noChangeAspect="1"/>
+            </wp:cNvGraphicFramePr>
+            <a:graphic>
+              <a:graphicData uri="http://schemas.openxmlformats.org/drawingml/2006/picture">
+                <pic:pic>
+                  <pic:nvPicPr>
+                    <pic:cNvPr id="0" name="media_1791256873703.png"/>
+                    <pic:cNvPicPr/>
+                  </pic:nvPicPr>
+                  <pic:blipFill>
+                    <a:blip r:embed="rId14"/>
+                    <a:stretch>
+                      <a:fillRect/>
+                    </a:stretch>
+                  </pic:blipFill>
+                  <pic:spPr>
+                    <a:xfrm>
+                      <a:off x="0" y="0"/>
+                      <a:ext cx="5669280" cy="3980676"/>
+                    </a:xfrm>
+                    <a:prstGeom prst="rect"/>
+                  </pic:spPr>
+                </pic:pic>
+              </a:graphicData>
+            </a:graphic>
+          </wp:inline>
+        </w:drawing>
+      </w:r>
+    </w:p>
+    <w:p>
+      <w:pPr>
+        <w:spacing w:before="40" w:after="200"/>
+      </w:pPr>
+      <w:r>
+        <w:rPr>
+          <w:i/>
+          <w:sz w:val="18"/>
+        </w:rPr>
+        <w:t>Tab 2 Self-Evolution view displaying generation evolution history and the MTTR reduction bar chart (-41.6% drop).</w:t>
+      </w:r>
+    </w:p>
+    <w:p>
+      <w:pPr>
+        <w:spacing w:before="160" w:after="40"/>
+      </w:pPr>
+      <w:r>
+        <w:rPr>
+          <w:b/>
+          <w:sz w:val="20"/>
+        </w:rPr>
+        <w:t>Figure 7: Formal Safety Verification Gate &amp; Non-Regression Invariant Audit</w:t>
+      </w:r>
+    </w:p>
+    <w:p>
+      <w:r>
+        <w:drawing>
+          <wp:inline xmlns:a="http://schemas.openxmlformats.org/drawingml/2006/main" xmlns:pic="http://schemas.openxmlformats.org/drawingml/2006/picture">
+            <wp:extent cx="5669280" cy="3980676"/>
+            <wp:docPr id="7" name="Picture 7"/>
+            <wp:cNvGraphicFramePr>
+              <a:graphicFrameLocks noChangeAspect="1"/>
+            </wp:cNvGraphicFramePr>
+            <a:graphic>
+              <a:graphicData uri="http://schemas.openxmlformats.org/drawingml/2006/picture">
+                <pic:pic>
+                  <pic:nvPicPr>
+                    <pic:cNvPr id="0" name="media_1791256838930.png"/>
+                    <pic:cNvPicPr/>
+                  </pic:nvPicPr>
+                  <pic:blipFill>
+                    <a:blip r:embed="rId15"/>
+                    <a:stretch>
+                      <a:fillRect/>
+                    </a:stretch>
+                  </pic:blipFill>
+                  <pic:spPr>
+                    <a:xfrm>
+                      <a:off x="0" y="0"/>
+                      <a:ext cx="5669280" cy="3980676"/>
+                    </a:xfrm>
+                    <a:prstGeom prst="rect"/>
+                  </pic:spPr>
+                </pic:pic>
+              </a:graphicData>
+            </a:graphic>
+          </wp:inline>
+        </w:drawing>
+      </w:r>
+    </w:p>
+    <w:p>
+      <w:pPr>
+        <w:spacing w:before="40" w:after="200"/>
+      </w:pPr>
+      <w:r>
+        <w:rPr>
+          <w:i/>
+          <w:sz w:val="18"/>
+        </w:rPr>
+        <w:t>Formal Safety Verification Gate confirming zero cycles, zero disconnected orphan nodes, and zero empirical regression.</w:t>
+      </w:r>
+    </w:p>
+    <w:p>
+      <w:pPr>
+        <w:spacing w:before="160" w:after="40"/>
+      </w:pPr>
+      <w:r>
+        <w:rPr>
+          <w:b/>
+          <w:sz w:val="20"/>
+        </w:rPr>
+        <w:t>Figure 8: Adversarial Cycle Injection Stress Testing (Zero-Trust Interception)</w:t>
+      </w:r>
+    </w:p>
+    <w:p>
+      <w:r>
+        <w:drawing>
+          <wp:inline xmlns:a="http://schemas.openxmlformats.org/drawingml/2006/main" xmlns:pic="http://schemas.openxmlformats.org/drawingml/2006/picture">
+            <wp:extent cx="5669280" cy="4700409"/>
+            <wp:docPr id="8" name="Picture 8"/>
+            <wp:cNvGraphicFramePr>
+              <a:graphicFrameLocks noChangeAspect="1"/>
+            </wp:cNvGraphicFramePr>
+            <a:graphic>
+              <a:graphicData uri="http://schemas.openxmlformats.org/drawingml/2006/picture">
+                <pic:pic>
+                  <pic:nvPicPr>
+                    <pic:cNvPr id="0" name="media_1791251292751.png"/>
+                    <pic:cNvPicPr/>
+                  </pic:nvPicPr>
+                  <pic:blipFill>
+                    <a:blip r:embed="rId16"/>
+                    <a:stretch>
+                      <a:fillRect/>
+                    </a:stretch>
+                  </pic:blipFill>
+                  <pic:spPr>
+                    <a:xfrm>
+                      <a:off x="0" y="0"/>
+                      <a:ext cx="5669280" cy="4700409"/>
+                    </a:xfrm>
+                    <a:prstGeom prst="rect"/>
+                  </pic:spPr>
+                </pic:pic>
+              </a:graphicData>
+            </a:graphic>
+          </wp:inline>
+        </w:drawing>
+      </w:r>
+    </w:p>
+    <w:p>
+      <w:pPr>
+        <w:spacing w:before="40" w:after="200"/>
+      </w:pPr>
+      <w:r>
+        <w:rPr>
+          <w:i/>
+          <w:sz w:val="18"/>
+        </w:rPr>
+        <w:t>Adversarial Cycle Injection Stress Test. Kahn's elimination failure blocks deployment and preserves production cluster safety.</w:t>
+      </w:r>
+    </w:p>
+    <w:p>
+      <w:pPr>
+        <w:spacing w:before="160" w:after="40"/>
+      </w:pPr>
+      <w:r>
+        <w:rPr>
+          <w:b/>
+          <w:sz w:val="20"/>
+        </w:rPr>
+        <w:t>Figure 9: Real-Time HTTP Transaction Inspector &amp; Regulatory Audit Trail</w:t>
+      </w:r>
+    </w:p>
+    <w:p>
+      <w:r>
+        <w:drawing>
+          <wp:inline xmlns:a="http://schemas.openxmlformats.org/drawingml/2006/main" xmlns:pic="http://schemas.openxmlformats.org/drawingml/2006/picture">
+            <wp:extent cx="5669280" cy="2934295"/>
+            <wp:docPr id="9" name="Picture 9"/>
+            <wp:cNvGraphicFramePr>
+              <a:graphicFrameLocks noChangeAspect="1"/>
+            </wp:cNvGraphicFramePr>
+            <a:graphic>
+              <a:graphicData uri="http://schemas.openxmlformats.org/drawingml/2006/picture">
+                <pic:pic>
+                  <pic:nvPicPr>
+                    <pic:cNvPr id="0" name="media_1790352891164.png"/>
+                    <pic:cNvPicPr/>
+                  </pic:nvPicPr>
+                  <pic:blipFill>
+                    <a:blip r:embed="rId17"/>
+                    <a:stretch>
+                      <a:fillRect/>
+                    </a:stretch>
+                  </pic:blipFill>
+                  <pic:spPr>
+                    <a:xfrm>
+                      <a:off x="0" y="0"/>
+                      <a:ext cx="5669280" cy="2934295"/>
+                    </a:xfrm>
+                    <a:prstGeom prst="rect"/>
+                  </pic:spPr>
+                </pic:pic>
+              </a:graphicData>
+            </a:graphic>
+          </wp:inline>
+        </w:drawing>
+      </w:r>
+    </w:p>
+    <w:p>
+      <w:pPr>
+        <w:spacing w:before="40" w:after="200"/>
+      </w:pPr>
+      <w:r>
+        <w:rPr>
+          <w:i/>
+          <w:sz w:val="18"/>
+        </w:rPr>
+        <w:t>Real-time HTTP REST transaction inspector and cluster event stream log.</w:t>
+      </w:r>
+    </w:p>
+    <w:p>
+      <w:pPr>
+        <w:spacing w:before="160" w:after="40"/>
+      </w:pPr>
+      <w:r>
+        <w:rPr>
+          <w:b/>
+          <w:sz w:val="20"/>
+        </w:rPr>
+        <w:t>Figure 10: Multi-Scenario Benchmark Diagnostics Across Microservice Domains</w:t>
+      </w:r>
+    </w:p>
+    <w:p>
+      <w:r>
+        <w:drawing>
+          <wp:inline xmlns:a="http://schemas.openxmlformats.org/drawingml/2006/main" xmlns:pic="http://schemas.openxmlformats.org/drawingml/2006/picture">
+            <wp:extent cx="5669280" cy="2934295"/>
+            <wp:docPr id="10" name="Picture 10"/>
+            <wp:cNvGraphicFramePr>
+              <a:graphicFrameLocks noChangeAspect="1"/>
+            </wp:cNvGraphicFramePr>
+            <a:graphic>
+              <a:graphicData uri="http://schemas.openxmlformats.org/drawingml/2006/picture">
+                <pic:pic>
+                  <pic:nvPicPr>
+                    <pic:cNvPr id="0" name="media_1790353700694.png"/>
+                    <pic:cNvPicPr/>
+                  </pic:nvPicPr>
+                  <pic:blipFill>
+                    <a:blip r:embed="rId18"/>
+                    <a:stretch>
+                      <a:fillRect/>
+                    </a:stretch>
+                  </pic:blipFill>
+                  <pic:spPr>
+                    <a:xfrm>
+                      <a:off x="0" y="0"/>
+                      <a:ext cx="5669280" cy="2934295"/>
+                    </a:xfrm>
+                    <a:prstGeom prst="rect"/>
+                  </pic:spPr>
+                </pic:pic>
+              </a:graphicData>
+            </a:graphic>
+          </wp:inline>
+        </w:drawing>
+      </w:r>
+    </w:p>
+    <w:p>
+      <w:pPr>
+        <w:spacing w:before="40" w:after="200"/>
+      </w:pPr>
+      <w:r>
+        <w:rPr>
+          <w:i/>
+          <w:sz w:val="18"/>
+        </w:rPr>
+        <w:t>Automated diagnosis across multi-service failure scenarios.</w:t>
+      </w:r>
     </w:p>
     <w:p>
       <w:pPr>

</xml_diff>